<commit_message>
Canon de 3.A.15 y 3.A.19; IHH y elasticidad de la demanda de mercado unificados
- Fichas nuevas con referencia en el 3.A.15: disuasion-entrada, costes-transaccion, contratos-incompletos, estructura-conducta-resultado, modelos-gerencialistas; mercados-impugnables reescrita (3 condiciones correctas, configuración sostenible).
- Fichas nuevas con referencia en el 3.A.19: cournot, bertrand, stackelberg, cartel; filas al día en unas 25 fichas; notación, mapa, cambios, informe y pendientes-coherencia.
- 3.A.15: IHH (no HHI), ε_{Q,p} y n en Cowling-Waterson; 3.A.19: el IHH de la telefonía móvil en su escala de 0 a 1 (0,28).

Co-Authored-By: Claude Opus 5.5 <noreply@anthropic.com>
Claude-Session: https://claude.ai/code/session_01PWJgAjs4PN1Rvp3aLA4tqT
</commit_message>
<xml_diff>
--- a/oposicion/temario/tercer-ejercicio/3A15.docx
+++ b/oposicion/temario/tercer-ejercicio/3A15.docx
@@ -15132,7 +15132,7 @@
         <w:t xml:space="preserve"> </w:t>
       </w:r>
       <w:r>
-        <w:t xml:space="preserve">y el nacimiento de la TOI en una frase; el paradigma ECR con su esquema, el HHI y sus críticas, y la respuesta de</w:t>
+        <w:t xml:space="preserve">y el nacimiento de la TOI en una frase; el paradigma ECR con su esquema, el IHH y sus críticas, y la respuesta de</w:t>
       </w:r>
       <w:r>
         <w:t xml:space="preserve"> </w:t>
@@ -15887,7 +15887,7 @@
             <m:rPr>
               <m:sty m:val="p"/>
             </m:rPr>
-            <m:t>H</m:t>
+            <m:t>I</m:t>
           </m:r>
           <m:r>
             <m:rPr>
@@ -15899,7 +15899,7 @@
             <m:rPr>
               <m:sty m:val="p"/>
             </m:rPr>
-            <m:t>I</m:t>
+            <m:t>H</m:t>
           </m:r>
           <m:r>
             <m:rPr>
@@ -15930,7 +15930,7 @@
             </m:sub>
             <m:sup>
               <m:r>
-                <m:t>J</m:t>
+                <m:t>n</m:t>
               </m:r>
             </m:sup>
             <m:e>
@@ -16085,7 +16085,7 @@
         </m:r>
       </m:oMath>
       <w:r>
-        <w:t xml:space="preserve">, ordenadas de mayor a menor; el HHI vale 10.000 en el monopolio.</w:t>
+        <w:t xml:space="preserve">, ordenadas de mayor a menor; el IHH vale 10.000 en el monopolio.</w:t>
       </w:r>
       <w:r>
         <w:rPr>
@@ -16124,7 +16124,7 @@
         <w:t xml:space="preserve"> </w:t>
       </w:r>
       <w:r>
-        <w:t xml:space="preserve">medio ponderado por las cuotas es proporcional al HHI,</w:t>
+        <w:t xml:space="preserve">medio ponderado por las cuotas es proporcional al IHH,</w:t>
       </w:r>
       <w:r>
         <w:t xml:space="preserve"> </w:t>
@@ -16191,7 +16191,7 @@
           <m:rPr>
             <m:sty m:val="p"/>
           </m:rPr>
-          <m:t>H</m:t>
+          <m:t>I</m:t>
         </m:r>
         <m:r>
           <m:rPr>
@@ -16203,7 +16203,7 @@
           <m:rPr>
             <m:sty m:val="p"/>
           </m:rPr>
-          <m:t>I</m:t>
+          <m:t>H</m:t>
         </m:r>
         <m:r>
           <m:rPr>
@@ -16241,7 +16241,7 @@
                   </m:e>
                   <m:sub>
                     <m:r>
-                      <m:t>q</m:t>
+                      <m:t>Q</m:t>
                     </m:r>
                     <m:r>
                       <m:rPr>
@@ -24394,7 +24394,7 @@
               </m:e>
               <m:sub>
                 <m:r>
-                  <m:t>q</m:t>
+                  <m:t>Q</m:t>
                 </m:r>
                 <m:r>
                   <m:rPr>
@@ -29380,7 +29380,7 @@
                     </m:e>
                     <m:sub>
                       <m:r>
-                        <m:t>q</m:t>
+                        <m:t>Q</m:t>
                       </m:r>
                       <m:r>
                         <m:rPr>
@@ -29559,7 +29559,7 @@
               </m:e>
               <m:sub>
                 <m:r>
-                  <m:t>q</m:t>
+                  <m:t>Q</m:t>
                 </m:r>
                 <m:r>
                   <m:rPr>
@@ -29584,7 +29584,7 @@
           <m:rPr>
             <m:sty m:val="p"/>
           </m:rPr>
-          <m:t>H</m:t>
+          <m:t>I</m:t>
         </m:r>
         <m:r>
           <m:rPr>
@@ -29596,7 +29596,7 @@
           <m:rPr>
             <m:sty m:val="p"/>
           </m:rPr>
-          <m:t>I</m:t>
+          <m:t>H</m:t>
         </m:r>
         <m:r>
           <m:rPr>
@@ -29634,7 +29634,7 @@
                   </m:e>
                   <m:sub>
                     <m:r>
-                      <m:t>q</m:t>
+                      <m:t>Q</m:t>
                     </m:r>
                     <m:r>
                       <m:rPr>
@@ -39567,7 +39567,7 @@
         <w:t xml:space="preserve"> </w:t>
       </w:r>
       <w:r>
-        <w:t xml:space="preserve">El HHI es mejor en teoría, porque usa todas las cuotas y pesa más las grandes; la ratio de concentración se usa más en la práctica porque solo exige conocer las cuotas de las mayores empresas. Las autoridades usan el HHI para filtrar las concentraciones. En Estados Unidos, las directrices de 2023 presumen que una fusión reduce sustancialmente la competencia si deja un mercado muy concentrado (HHI superior a 1.800) y eleva el índice en más de 100 puntos, o si crea una empresa con más del 30 % de cuota y eleva el índice en más de 100 puntos</w:t>
+        <w:t xml:space="preserve">El IHH es mejor en teoría, porque usa todas las cuotas y pesa más las grandes; la ratio de concentración se usa más en la práctica porque solo exige conocer las cuotas de las mayores empresas. Las autoridades usan el IHH para filtrar las concentraciones. En Estados Unidos, las directrices de 2023 presumen que una fusión reduce sustancialmente la competencia si deja un mercado muy concentrado (IHH superior a 1.800) y eleva el índice en más de 100 puntos, o si crea una empresa con más del 30 % de cuota y eleva el índice en más de 100 puntos</w:t>
       </w:r>
       <w:r>
         <w:t xml:space="preserve"> </w:t>
@@ -39719,7 +39719,7 @@
         <w:t xml:space="preserve">)</w:t>
       </w:r>
       <w:r>
-        <w:t xml:space="preserve">. En la Unión Europea, las directrices de 2004 consideran improbables los problemas si el HHI tras la fusión no llega a 1.000, si está entre 1.000 y 2.000 y sube menos de 250 puntos, o si supera 2.000 y sube menos de 150</w:t>
+        <w:t xml:space="preserve">. En la Unión Europea, las directrices de 2004 consideran improbables los problemas si el IHH tras la fusión no llega a 1.000, si está entre 1.000 y 2.000 y sube menos de 250 puntos, o si supera 2.000 y sube menos de 150</w:t>
       </w:r>
       <w:r>
         <w:t xml:space="preserve"> </w:t>
@@ -39792,7 +39792,7 @@
         <w:t xml:space="preserve"> </w:t>
       </w:r>
       <w:r>
-        <w:t xml:space="preserve">Ejemplos: el oligopolio de las agencias de calificación, al que las exigencias regulatorias dan una ventaja difícil de igualar (S&amp;P, Moody’s y Fitch tienen el 92 % del mercado de la Unión Europea, con un HHI de unos 3.600, según</w:t>
+        <w:t xml:space="preserve">Ejemplos: el oligopolio de las agencias de calificación, al que las exigencias regulatorias dan una ventaja difícil de igualar (S&amp;P, Moody’s y Fitch tienen el 92 % del mercado de la Unión Europea, con un IHH de unos 3.600, según</w:t>
       </w:r>
       <w:r>
         <w:t xml:space="preserve"> </w:t>

</xml_diff>